<commit_message>
option to select style and word file creation working
</commit_message>
<xml_diff>
--- a/Final_Client_Manual.docx
+++ b/Final_Client_Manual.docx
@@ -2,25 +2,133 @@
 <file path=word/document.xml><?xml version="1.0" encoding="utf-8"?>
 <w:document xmlns:wpc="http://schemas.microsoft.com/office/word/2010/wordprocessingCanvas" xmlns:mo="http://schemas.microsoft.com/office/mac/office/2008/main" xmlns:mc="http://schemas.openxmlformats.org/markup-compatibility/2006" xmlns:mv="urn:schemas-microsoft-com:mac:vml" xmlns:o="urn:schemas-microsoft-com:office:office" xmlns:r="http://schemas.openxmlformats.org/officeDocument/2006/relationships" xmlns:m="http://schemas.openxmlformats.org/officeDocument/2006/math" xmlns:v="urn:schemas-microsoft-com:vml" xmlns:wp14="http://schemas.microsoft.com/office/word/2010/wordprocessingDrawing" xmlns:wp="http://schemas.openxmlformats.org/drawingml/2006/wordprocessingDrawing" xmlns:w10="urn:schemas-microsoft-com:office:word" xmlns:w="http://schemas.openxmlformats.org/wordprocessingml/2006/main" xmlns:w14="http://schemas.microsoft.com/office/word/2010/wordml" xmlns:wpg="http://schemas.microsoft.com/office/word/2010/wordprocessingGroup" xmlns:wpi="http://schemas.microsoft.com/office/word/2010/wordprocessingInk" xmlns:wne="http://schemas.microsoft.com/office/word/2006/wordml" xmlns:wps="http://schemas.microsoft.com/office/word/2010/wordprocessingShape" mc:Ignorable="w14 wp14">
   <w:body>
+    <w:p/>
+    <w:p/>
     <w:p>
       <w:pPr>
-        <w:pStyle w:val="Title"/>
+        <w:jc w:val="left"/>
       </w:pPr>
       <w:r>
-        <w:t>National Cooperative Database (NCD)</w:t>
+        <w:drawing>
+          <wp:inline xmlns:a="http://schemas.openxmlformats.org/drawingml/2006/main" xmlns:pic="http://schemas.openxmlformats.org/drawingml/2006/picture">
+            <wp:extent cx="1567543" cy="822960"/>
+            <wp:docPr id="1" name="Picture 1"/>
+            <wp:cNvGraphicFramePr>
+              <a:graphicFrameLocks noChangeAspect="1"/>
+            </wp:cNvGraphicFramePr>
+            <a:graphic>
+              <a:graphicData uri="http://schemas.openxmlformats.org/drawingml/2006/picture">
+                <pic:pic>
+                  <pic:nvPicPr>
+                    <pic:cNvPr id="0" name="National-Emblem-of-India.jpg"/>
+                    <pic:cNvPicPr/>
+                  </pic:nvPicPr>
+                  <pic:blipFill>
+                    <a:blip r:embed="rId9"/>
+                    <a:stretch>
+                      <a:fillRect/>
+                    </a:stretch>
+                  </pic:blipFill>
+                  <pic:spPr>
+                    <a:xfrm>
+                      <a:off x="0" y="0"/>
+                      <a:ext cx="1567543" cy="822960"/>
+                    </a:xfrm>
+                    <a:prstGeom prst="rect"/>
+                  </pic:spPr>
+                </pic:pic>
+              </a:graphicData>
+            </a:graphic>
+          </wp:inline>
+        </w:drawing>
+      </w:r>
+    </w:p>
+    <w:p/>
+    <w:p/>
+    <w:p>
+      <w:r>
+        <w:rPr>
+          <w:rFonts w:ascii="Arial" w:hAnsi="Arial"/>
+          <w:b/>
+          <w:color w:val="D97706"/>
+          <w:sz w:val="21"/>
+        </w:rPr>
+        <w:t>ORANGEHRMS</w:t>
       </w:r>
     </w:p>
     <w:p>
       <w:pPr>
-        <w:jc w:val="center"/>
+        <w:pBdr>
+          <w:bottom w:val="single" w:sz="18" w:space="4" w:color="1B365D"/>
+        </w:pBdr>
       </w:pPr>
       <w:r>
+        <w:rPr>
+          <w:rFonts w:ascii="Arial" w:hAnsi="Arial"/>
+          <w:b/>
+          <w:color w:val="1B365D"/>
+          <w:sz w:val="56"/>
+        </w:rPr>
         <w:t>Comprehensive User Manual</w:t>
       </w:r>
     </w:p>
     <w:p>
       <w:r>
-        <w:t>Silver Touch Technologies Ltd.</w:t>
+        <w:rPr>
+          <w:rFonts w:ascii="Arial" w:hAnsi="Arial"/>
+          <w:i/>
+          <w:color w:val="787878"/>
+          <w:sz w:val="26"/>
+        </w:rPr>
+        <w:t>Comprehensive User Guide &amp; Technical Documentation</w:t>
+      </w:r>
+    </w:p>
+    <w:p/>
+    <w:p/>
+    <w:p/>
+    <w:p/>
+    <w:p/>
+    <w:p/>
+    <w:p/>
+    <w:p/>
+    <w:p>
+      <w:pPr>
+        <w:spacing w:line="288" w:lineRule="auto"/>
+      </w:pPr>
+      <w:r>
+        <w:rPr>
+          <w:b/>
+          <w:color w:val="646464"/>
+          <w:sz w:val="18"/>
+        </w:rPr>
+        <w:t xml:space="preserve">DOCUMENT VERSION: </w:t>
+      </w:r>
+      <w:r>
+        <w:t>1.0 (Official Draft)</w:t>
+        <w:br/>
+      </w:r>
+      <w:r>
+        <w:rPr>
+          <w:b/>
+          <w:color w:val="646464"/>
+          <w:sz w:val="18"/>
+        </w:rPr>
+        <w:t xml:space="preserve">PUBLISHED DATE:   </w:t>
+      </w:r>
+      <w:r>
+        <w:t>July 2026</w:t>
+        <w:br/>
+      </w:r>
+      <w:r>
+        <w:rPr>
+          <w:b/>
+          <w:color w:val="646464"/>
+          <w:sz w:val="18"/>
+        </w:rPr>
+        <w:t xml:space="preserve">GENERATED BY:     </w:t>
+      </w:r>
+      <w:r>
+        <w:t>Documentation Automation Engine</w:t>
       </w:r>
     </w:p>
     <w:p>
@@ -33,59 +141,162 @@
         <w:pStyle w:val="Heading1"/>
       </w:pPr>
       <w:r>
+        <w:rPr>
+          <w:rFonts w:ascii="Arial" w:hAnsi="Arial"/>
+          <w:color w:val="1B365D"/>
+        </w:rPr>
         <w:t>Revision History</w:t>
       </w:r>
     </w:p>
     <w:tbl>
       <w:tblPr>
-        <w:tblStyle w:val="TableGrid"/>
         <w:tblW w:type="auto" w:w="0"/>
+        <w:tblLayout w:type="fixed"/>
         <w:tblLook w:firstColumn="1" w:firstRow="1" w:lastColumn="0" w:lastRow="0" w:noHBand="0" w:noVBand="1" w:val="04A0"/>
+        <w:tblBorders>
+          <w:top w:val="single" w:sz="4" w:space="0" w:color="E2E8F0"/>
+          <w:left w:val="single" w:sz="4" w:space="0" w:color="E2E8F0"/>
+          <w:bottom w:val="single" w:sz="4" w:space="0" w:color="E2E8F0"/>
+          <w:right w:val="single" w:sz="4" w:space="0" w:color="E2E8F0"/>
+          <w:insideH w:val="single" w:sz="4" w:space="0" w:color="E2E8F0"/>
+          <w:insideV w:val="single" w:sz="4" w:space="0" w:color="E2E8F0"/>
+        </w:tblBorders>
       </w:tblPr>
       <w:tblGrid>
-        <w:gridCol w:w="2160"/>
-        <w:gridCol w:w="2160"/>
-        <w:gridCol w:w="2160"/>
-        <w:gridCol w:w="2160"/>
+        <w:gridCol w:w="1152"/>
+        <w:gridCol w:w="1584"/>
+        <w:gridCol w:w="2016"/>
+        <w:gridCol w:w="2016"/>
+        <w:gridCol w:w="2592"/>
       </w:tblGrid>
       <w:tr>
         <w:tc>
           <w:tcPr>
-            <w:tcW w:type="dxa" w:w="2160"/>
+            <w:tcW w:type="dxa" w:w="1872"/>
+            <w:shd w:fill="1B365D"/>
+            <w:tcMar>
+              <w:top w:w="100" w:type="dxa"/>
+              <w:bottom w:w="100" w:type="dxa"/>
+              <w:left w:w="120" w:type="dxa"/>
+              <w:right w:w="120" w:type="dxa"/>
+            </w:tcMar>
           </w:tcPr>
           <w:p>
+            <w:pPr>
+              <w:jc w:val="left"/>
+            </w:pPr>
             <w:r>
+              <w:rPr>
+                <w:rFonts w:ascii="Arial" w:hAnsi="Arial"/>
+                <w:b/>
+                <w:color w:val="FFFFFF"/>
+                <w:sz w:val="19"/>
+              </w:rPr>
+              <w:t>Ver.</w:t>
+            </w:r>
+          </w:p>
+        </w:tc>
+        <w:tc>
+          <w:tcPr>
+            <w:tcW w:type="dxa" w:w="1872"/>
+            <w:shd w:fill="1B365D"/>
+            <w:tcMar>
+              <w:top w:w="100" w:type="dxa"/>
+              <w:bottom w:w="100" w:type="dxa"/>
+              <w:left w:w="120" w:type="dxa"/>
+              <w:right w:w="120" w:type="dxa"/>
+            </w:tcMar>
+          </w:tcPr>
+          <w:p>
+            <w:pPr>
+              <w:jc w:val="left"/>
+            </w:pPr>
+            <w:r>
+              <w:rPr>
+                <w:rFonts w:ascii="Arial" w:hAnsi="Arial"/>
+                <w:b/>
+                <w:color w:val="FFFFFF"/>
+                <w:sz w:val="19"/>
+              </w:rPr>
               <w:t>Date</w:t>
             </w:r>
           </w:p>
         </w:tc>
         <w:tc>
           <w:tcPr>
-            <w:tcW w:type="dxa" w:w="2160"/>
+            <w:tcW w:type="dxa" w:w="1872"/>
+            <w:shd w:fill="1B365D"/>
+            <w:tcMar>
+              <w:top w:w="100" w:type="dxa"/>
+              <w:bottom w:w="100" w:type="dxa"/>
+              <w:left w:w="120" w:type="dxa"/>
+              <w:right w:w="120" w:type="dxa"/>
+            </w:tcMar>
           </w:tcPr>
           <w:p>
+            <w:pPr>
+              <w:jc w:val="left"/>
+            </w:pPr>
             <w:r>
-              <w:t>Version</w:t>
+              <w:rPr>
+                <w:rFonts w:ascii="Arial" w:hAnsi="Arial"/>
+                <w:b/>
+                <w:color w:val="FFFFFF"/>
+                <w:sz w:val="19"/>
+              </w:rPr>
+              <w:t>Author</w:t>
             </w:r>
           </w:p>
         </w:tc>
         <w:tc>
           <w:tcPr>
-            <w:tcW w:type="dxa" w:w="2160"/>
+            <w:tcW w:type="dxa" w:w="1872"/>
+            <w:shd w:fill="1B365D"/>
+            <w:tcMar>
+              <w:top w:w="100" w:type="dxa"/>
+              <w:bottom w:w="100" w:type="dxa"/>
+              <w:left w:w="120" w:type="dxa"/>
+              <w:right w:w="120" w:type="dxa"/>
+            </w:tcMar>
           </w:tcPr>
           <w:p>
+            <w:pPr>
+              <w:jc w:val="left"/>
+            </w:pPr>
             <w:r>
-              <w:t>Description</w:t>
+              <w:rPr>
+                <w:rFonts w:ascii="Arial" w:hAnsi="Arial"/>
+                <w:b/>
+                <w:color w:val="FFFFFF"/>
+                <w:sz w:val="19"/>
+              </w:rPr>
+              <w:t>Approved By</w:t>
             </w:r>
           </w:p>
         </w:tc>
         <w:tc>
           <w:tcPr>
-            <w:tcW w:type="dxa" w:w="2160"/>
+            <w:tcW w:type="dxa" w:w="1872"/>
+            <w:shd w:fill="1B365D"/>
+            <w:tcMar>
+              <w:top w:w="100" w:type="dxa"/>
+              <w:bottom w:w="100" w:type="dxa"/>
+              <w:left w:w="120" w:type="dxa"/>
+              <w:right w:w="120" w:type="dxa"/>
+            </w:tcMar>
           </w:tcPr>
           <w:p>
+            <w:pPr>
+              <w:jc w:val="left"/>
+            </w:pPr>
             <w:r>
-              <w:t>Author</w:t>
+              <w:rPr>
+                <w:rFonts w:ascii="Arial" w:hAnsi="Arial"/>
+                <w:b/>
+                <w:color w:val="FFFFFF"/>
+                <w:sz w:val="19"/>
+              </w:rPr>
+              <w:t>Details of Changes</w:t>
             </w:r>
           </w:p>
         </w:tc>
@@ -93,41 +304,101 @@
       <w:tr>
         <w:tc>
           <w:tcPr>
-            <w:tcW w:type="dxa" w:w="2160"/>
+            <w:tcW w:type="dxa" w:w="1872"/>
+            <w:tcMar>
+              <w:top w:w="100" w:type="dxa"/>
+              <w:bottom w:w="100" w:type="dxa"/>
+              <w:left w:w="120" w:type="dxa"/>
+              <w:right w:w="120" w:type="dxa"/>
+            </w:tcMar>
           </w:tcPr>
           <w:p>
             <w:r>
-              <w:t>2026-07-03</w:t>
-            </w:r>
-          </w:p>
-        </w:tc>
-        <w:tc>
-          <w:tcPr>
-            <w:tcW w:type="dxa" w:w="2160"/>
-          </w:tcPr>
-          <w:p>
-            <w:r>
+              <w:rPr>
+                <w:rFonts w:ascii="Arial" w:hAnsi="Arial"/>
+                <w:sz w:val="18"/>
+              </w:rPr>
               <w:t>1.0</w:t>
             </w:r>
           </w:p>
         </w:tc>
         <w:tc>
           <w:tcPr>
-            <w:tcW w:type="dxa" w:w="2160"/>
+            <w:tcW w:type="dxa" w:w="1872"/>
+            <w:tcMar>
+              <w:top w:w="100" w:type="dxa"/>
+              <w:bottom w:w="100" w:type="dxa"/>
+              <w:left w:w="120" w:type="dxa"/>
+              <w:right w:w="120" w:type="dxa"/>
+            </w:tcMar>
           </w:tcPr>
           <w:p>
             <w:r>
-              <w:t>Initial Draft generated by Bot</w:t>
+              <w:rPr>
+                <w:rFonts w:ascii="Arial" w:hAnsi="Arial"/>
+                <w:sz w:val="18"/>
+              </w:rPr>
+              <w:t>2026-07-06</w:t>
             </w:r>
           </w:p>
         </w:tc>
         <w:tc>
           <w:tcPr>
-            <w:tcW w:type="dxa" w:w="2160"/>
+            <w:tcW w:type="dxa" w:w="1872"/>
+            <w:tcMar>
+              <w:top w:w="100" w:type="dxa"/>
+              <w:bottom w:w="100" w:type="dxa"/>
+              <w:left w:w="120" w:type="dxa"/>
+              <w:right w:w="120" w:type="dxa"/>
+            </w:tcMar>
           </w:tcPr>
           <w:p>
             <w:r>
-              <w:t>Documentation Team</w:t>
+              <w:rPr>
+                <w:rFonts w:ascii="Arial" w:hAnsi="Arial"/>
+                <w:sz w:val="18"/>
+              </w:rPr>
+              <w:t>Automation Bot</w:t>
+            </w:r>
+          </w:p>
+        </w:tc>
+        <w:tc>
+          <w:tcPr>
+            <w:tcW w:type="dxa" w:w="1872"/>
+            <w:tcMar>
+              <w:top w:w="100" w:type="dxa"/>
+              <w:bottom w:w="100" w:type="dxa"/>
+              <w:left w:w="120" w:type="dxa"/>
+              <w:right w:w="120" w:type="dxa"/>
+            </w:tcMar>
+          </w:tcPr>
+          <w:p>
+            <w:r>
+              <w:rPr>
+                <w:rFonts w:ascii="Arial" w:hAnsi="Arial"/>
+                <w:sz w:val="18"/>
+              </w:rPr>
+              <w:t>Quality Lead</w:t>
+            </w:r>
+          </w:p>
+        </w:tc>
+        <w:tc>
+          <w:tcPr>
+            <w:tcW w:type="dxa" w:w="1872"/>
+            <w:tcMar>
+              <w:top w:w="100" w:type="dxa"/>
+              <w:bottom w:w="100" w:type="dxa"/>
+              <w:left w:w="120" w:type="dxa"/>
+              <w:right w:w="120" w:type="dxa"/>
+            </w:tcMar>
+          </w:tcPr>
+          <w:p>
+            <w:r>
+              <w:rPr>
+                <w:rFonts w:ascii="Arial" w:hAnsi="Arial"/>
+                <w:sz w:val="18"/>
+              </w:rPr>
+              <w:t>Generated corporate client manual.</w:t>
             </w:r>
           </w:p>
         </w:tc>
@@ -143,12 +414,80 @@
         <w:pStyle w:val="Heading1"/>
       </w:pPr>
       <w:r>
+        <w:rPr>
+          <w:rFonts w:ascii="Arial" w:hAnsi="Arial"/>
+          <w:color w:val="1B365D"/>
+        </w:rPr>
         <w:t>Table of Contents</w:t>
       </w:r>
     </w:p>
     <w:p>
+      <w:pPr>
+        <w:spacing w:after="240"/>
+      </w:pPr>
       <w:r>
-        <w:t>[Right-click and select 'Update Field' in Word to generate TOC]</w:t>
+        <w:rPr>
+          <w:i/>
+          <w:color w:val="6E6E6E"/>
+          <w:sz w:val="19"/>
+        </w:rPr>
+        <w:t>This Table of Contents is dynamically generated using native Microsoft Word index fields. Please right-click the block below and select 'Update Field' to refresh page numbers.</w:t>
+      </w:r>
+    </w:p>
+    <w:p>
+      <w:fldChar w:fldCharType="begin"/>
+      <w:instrText xml:space="preserve">TOC \o "1-3" \h \z \u</w:instrText>
+      <w:fldChar w:fldCharType="separate"/>
+      <w:r>
+        <w:t>[Right-click here and select 'Update Field' to generate Table of Contents]</w:t>
+      </w:r>
+      <w:fldChar w:fldCharType="end"/>
+    </w:p>
+    <w:p>
+      <w:r>
+        <w:br w:type="page"/>
+      </w:r>
+    </w:p>
+    <w:p/>
+    <w:p/>
+    <w:p/>
+    <w:p/>
+    <w:p/>
+    <w:p/>
+    <w:p>
+      <w:pPr>
+        <w:jc w:val="center"/>
+      </w:pPr>
+      <w:r>
+        <w:rPr>
+          <w:rFonts w:ascii="Arial" w:hAnsi="Arial"/>
+          <w:b/>
+          <w:color w:val="1B365D"/>
+          <w:sz w:val="48"/>
+        </w:rPr>
+        <w:t>Session 20260706 111411</w:t>
+      </w:r>
+    </w:p>
+    <w:p>
+      <w:pPr>
+        <w:jc w:val="center"/>
+        <w:pBdr>
+          <w:bottom w:val="single" w:sz="12" w:space="4" w:color="D97706"/>
+        </w:pBdr>
+      </w:pPr>
+    </w:p>
+    <w:p>
+      <w:pPr>
+        <w:jc w:val="center"/>
+      </w:pPr>
+      <w:r>
+        <w:rPr>
+          <w:rFonts w:ascii="Arial" w:hAnsi="Arial"/>
+          <w:i/>
+          <w:color w:val="6E6E6E"/>
+          <w:sz w:val="22"/>
+        </w:rPr>
+        <w:t>Detailed procedural steps and interface dictionary for Session 20260706 111411.</w:t>
       </w:r>
     </w:p>
     <w:p>
@@ -159,416 +498,32 @@
     <w:p>
       <w:pPr>
         <w:pStyle w:val="Heading1"/>
+        <w:pBdr>
+          <w:bottom w:val="single" w:sz="6" w:space="4" w:color="D97706"/>
+        </w:pBdr>
       </w:pPr>
       <w:r>
-        <w:t>1. Screen 1 Interface</w:t>
-      </w:r>
-    </w:p>
-    <w:p>
-      <w:r>
-        <w:drawing>
-          <wp:inline xmlns:a="http://schemas.openxmlformats.org/drawingml/2006/main" xmlns:pic="http://schemas.openxmlformats.org/drawingml/2006/picture">
-            <wp:extent cx="5486400" cy="2700338"/>
-            <wp:docPr id="1" name="Picture 1"/>
-            <wp:cNvGraphicFramePr>
-              <a:graphicFrameLocks noChangeAspect="1"/>
-            </wp:cNvGraphicFramePr>
-            <a:graphic>
-              <a:graphicData uri="http://schemas.openxmlformats.org/drawingml/2006/picture">
-                <pic:pic>
-                  <pic:nvPicPr>
-                    <pic:cNvPr id="0" name="screen_1_annotated.png"/>
-                    <pic:cNvPicPr/>
-                  </pic:nvPicPr>
-                  <pic:blipFill>
-                    <a:blip r:embed="rId9"/>
-                    <a:stretch>
-                      <a:fillRect/>
-                    </a:stretch>
-                  </pic:blipFill>
-                  <pic:spPr>
-                    <a:xfrm>
-                      <a:off x="0" y="0"/>
-                      <a:ext cx="5486400" cy="2700338"/>
-                    </a:xfrm>
-                    <a:prstGeom prst="rect"/>
-                  </pic:spPr>
-                </pic:pic>
-              </a:graphicData>
-            </a:graphic>
-          </wp:inline>
-        </w:drawing>
+        <w:rPr>
+          <w:rFonts w:ascii="Arial" w:hAnsi="Arial"/>
+          <w:color w:val="1B365D"/>
+        </w:rPr>
+        <w:t>Screen 1: Interface Details</w:t>
       </w:r>
     </w:p>
     <w:p>
       <w:pPr>
-        <w:pStyle w:val="Caption"/>
+        <w:spacing w:before="120"/>
+      </w:pPr>
+    </w:p>
+    <w:p>
+      <w:pPr>
         <w:jc w:val="center"/>
       </w:pPr>
       <w:r>
-        <w:t>Figure 1: Screen 1 View</w:t>
-      </w:r>
-    </w:p>
-    <w:p>
-      <w:pPr>
-        <w:pStyle w:val="Heading2"/>
-      </w:pPr>
-      <w:r>
-        <w:t>Procedure Steps</w:t>
-      </w:r>
-    </w:p>
-    <w:p>
-      <w:r>
-        <w:t xml:space="preserve">1. Enter the desired user name in the **User Name Filter** to restrict the search to that particular user; if the field is left empty, the system displays the error “User Name filter cannot be empty”.  </w:t>
-        <w:br/>
-        <w:t xml:space="preserve">2. Enter the appropriate value in the **Redacted Filter** to indicate whether redacted records should be included; if a non‑numeric or out‑of‑range value is entered, the system shows the error “Invalid redacted value – please enter a numeric value between 0 and 1”.  </w:t>
-        <w:br/>
-        <w:t>3. Enter the login identifier in the **Login Filter** to further narrow the results to a specific account; if the entry contains illegal characters, the system presents the error “Login must contain only letters and numbers”.</w:t>
-      </w:r>
-    </w:p>
-    <w:p>
-      <w:pPr>
-        <w:pStyle w:val="Heading2"/>
-      </w:pPr>
-      <w:r>
-        <w:t>Field Details</w:t>
-      </w:r>
-    </w:p>
-    <w:tbl>
-      <w:tblPr>
-        <w:tblStyle w:val="TableGrid"/>
-        <w:tblW w:type="auto" w:w="0"/>
-        <w:tblLook w:firstColumn="1" w:firstRow="1" w:lastColumn="0" w:lastRow="0" w:noHBand="0" w:noVBand="1" w:val="04A0"/>
-      </w:tblPr>
-      <w:tblGrid>
-        <w:gridCol w:w="4320"/>
-        <w:gridCol w:w="4320"/>
-      </w:tblGrid>
-      <w:tr>
-        <w:tc>
-          <w:tcPr>
-            <w:tcW w:type="dxa" w:w="4320"/>
-          </w:tcPr>
-          <w:p>
-            <w:r>
-              <w:t>Field Name</w:t>
-            </w:r>
-          </w:p>
-        </w:tc>
-        <w:tc>
-          <w:tcPr>
-            <w:tcW w:type="dxa" w:w="4320"/>
-          </w:tcPr>
-          <w:p>
-            <w:r>
-              <w:t>Description</w:t>
-            </w:r>
-          </w:p>
-        </w:tc>
-      </w:tr>
-      <w:tr>
-        <w:tc>
-          <w:tcPr>
-            <w:tcW w:type="dxa" w:w="4320"/>
-          </w:tcPr>
-          <w:p>
-            <w:r>
-              <w:t>User Name Filter -&gt; user-name</w:t>
-            </w:r>
-          </w:p>
-        </w:tc>
-        <w:tc>
-          <w:tcPr>
-            <w:tcW w:type="dxa" w:w="4320"/>
-          </w:tcPr>
-          <w:p>
-            <w:r>
-              <w:t>Enter the username you use to sign in (e.g., email or login ID). Optional; up to 50 characters.</w:t>
-            </w:r>
-          </w:p>
-        </w:tc>
-      </w:tr>
-      <w:tr>
-        <w:tc>
-          <w:tcPr>
-            <w:tcW w:type="dxa" w:w="4320"/>
-          </w:tcPr>
-          <w:p>
-            <w:r>
-              <w:t>Redacted Filter -&gt; [REDACTED]</w:t>
-            </w:r>
-          </w:p>
-        </w:tc>
-        <w:tc>
-          <w:tcPr>
-            <w:tcW w:type="dxa" w:w="4320"/>
-          </w:tcPr>
-          <w:p>
-            <w:r>
-              <w:t>Enter your password. Optional; characters will be hidden as you type.</w:t>
-            </w:r>
-          </w:p>
-        </w:tc>
-      </w:tr>
-      <w:tr>
-        <w:tc>
-          <w:tcPr>
-            <w:tcW w:type="dxa" w:w="4320"/>
-          </w:tcPr>
-          <w:p>
-            <w:r>
-              <w:t>Login Filter -&gt; Login</w:t>
-            </w:r>
-          </w:p>
-        </w:tc>
-        <w:tc>
-          <w:tcPr>
-            <w:tcW w:type="dxa" w:w="4320"/>
-          </w:tcPr>
-          <w:p>
-            <w:r>
-              <w:t>Tap the **Login** button to submit the credentials and access the system.</w:t>
-            </w:r>
-          </w:p>
-        </w:tc>
-      </w:tr>
-    </w:tbl>
-    <w:p>
-      <w:r>
-        <w:br w:type="page"/>
-      </w:r>
-    </w:p>
-    <w:p>
-      <w:pPr>
-        <w:pStyle w:val="Heading1"/>
-      </w:pPr>
-      <w:r>
-        <w:t>2. Screen 2 Interface</w:t>
-      </w:r>
-    </w:p>
-    <w:p>
-      <w:r>
         <w:drawing>
           <wp:inline xmlns:a="http://schemas.openxmlformats.org/drawingml/2006/main" xmlns:pic="http://schemas.openxmlformats.org/drawingml/2006/picture">
-            <wp:extent cx="5486400" cy="3196800"/>
+            <wp:extent cx="5303520" cy="2610326"/>
             <wp:docPr id="2" name="Picture 2"/>
-            <wp:cNvGraphicFramePr>
-              <a:graphicFrameLocks noChangeAspect="1"/>
-            </wp:cNvGraphicFramePr>
-            <a:graphic>
-              <a:graphicData uri="http://schemas.openxmlformats.org/drawingml/2006/picture">
-                <pic:pic>
-                  <pic:nvPicPr>
-                    <pic:cNvPr id="0" name="screen_2_annotated.png"/>
-                    <pic:cNvPicPr/>
-                  </pic:nvPicPr>
-                  <pic:blipFill>
-                    <a:blip r:embed="rId10"/>
-                    <a:stretch>
-                      <a:fillRect/>
-                    </a:stretch>
-                  </pic:blipFill>
-                  <pic:spPr>
-                    <a:xfrm>
-                      <a:off x="0" y="0"/>
-                      <a:ext cx="5486400" cy="3196800"/>
-                    </a:xfrm>
-                    <a:prstGeom prst="rect"/>
-                  </pic:spPr>
-                </pic:pic>
-              </a:graphicData>
-            </a:graphic>
-          </wp:inline>
-        </w:drawing>
-      </w:r>
-    </w:p>
-    <w:p>
-      <w:pPr>
-        <w:pStyle w:val="Caption"/>
-        <w:jc w:val="center"/>
-      </w:pPr>
-      <w:r>
-        <w:t>Figure 2: Screen 2 View</w:t>
-      </w:r>
-    </w:p>
-    <w:p>
-      <w:pPr>
-        <w:pStyle w:val="Heading2"/>
-      </w:pPr>
-      <w:r>
-        <w:t>Procedure Steps</w:t>
-      </w:r>
-    </w:p>
-    <w:p>
-      <w:r>
-        <w:t xml:space="preserve">1. Click the **Add to Cart** button to place the selected product into the shopping cart, establishing the item for purchase.  </w:t>
-        <w:br/>
-        <w:t>2. Click the **Add to Cart** button again to increase the product’s quantity in the cart; if duplicate entries are not allowed, the system displays the validation message “Item already in cart.”</w:t>
-      </w:r>
-    </w:p>
-    <w:p>
-      <w:pPr>
-        <w:pStyle w:val="Heading2"/>
-      </w:pPr>
-      <w:r>
-        <w:t>Field Details</w:t>
-      </w:r>
-    </w:p>
-    <w:tbl>
-      <w:tblPr>
-        <w:tblStyle w:val="TableGrid"/>
-        <w:tblW w:type="auto" w:w="0"/>
-        <w:tblLook w:firstColumn="1" w:firstRow="1" w:lastColumn="0" w:lastRow="0" w:noHBand="0" w:noVBand="1" w:val="04A0"/>
-      </w:tblPr>
-      <w:tblGrid>
-        <w:gridCol w:w="4320"/>
-        <w:gridCol w:w="4320"/>
-      </w:tblGrid>
-      <w:tr>
-        <w:tc>
-          <w:tcPr>
-            <w:tcW w:type="dxa" w:w="4320"/>
-          </w:tcPr>
-          <w:p>
-            <w:r>
-              <w:t>Field Name</w:t>
-            </w:r>
-          </w:p>
-        </w:tc>
-        <w:tc>
-          <w:tcPr>
-            <w:tcW w:type="dxa" w:w="4320"/>
-          </w:tcPr>
-          <w:p>
-            <w:r>
-              <w:t>Description</w:t>
-            </w:r>
-          </w:p>
-        </w:tc>
-      </w:tr>
-      <w:tr>
-        <w:tc>
-          <w:tcPr>
-            <w:tcW w:type="dxa" w:w="4320"/>
-          </w:tcPr>
-          <w:p>
-            <w:r>
-              <w:t>Form Field -&gt; Name (A to Z)</w:t>
-              <w:br/>
-              <w:t>Name (Z to A)</w:t>
-              <w:br/>
-              <w:t>Price (low to high)</w:t>
-              <w:br/>
-              <w:t>Price (high to low)</w:t>
-            </w:r>
-          </w:p>
-        </w:tc>
-        <w:tc>
-          <w:tcPr>
-            <w:tcW w:type="dxa" w:w="4320"/>
-          </w:tcPr>
-          <w:p>
-            <w:r>
-              <w:t>Select the desired sort order for the list: “Name (A‑Z)”, “Name (Z‑A)”, “Price (low to high)” or “Price (high to low)”. This field is optional.</w:t>
-            </w:r>
-          </w:p>
-        </w:tc>
-      </w:tr>
-    </w:tbl>
-    <w:p>
-      <w:r>
-        <w:br w:type="page"/>
-      </w:r>
-    </w:p>
-    <w:p>
-      <w:pPr>
-        <w:pStyle w:val="Heading1"/>
-      </w:pPr>
-      <w:r>
-        <w:t>3. Screen 3 Interface</w:t>
-      </w:r>
-    </w:p>
-    <w:p>
-      <w:r>
-        <w:drawing>
-          <wp:inline xmlns:a="http://schemas.openxmlformats.org/drawingml/2006/main" xmlns:pic="http://schemas.openxmlformats.org/drawingml/2006/picture">
-            <wp:extent cx="5486400" cy="2744640"/>
-            <wp:docPr id="3" name="Picture 3"/>
-            <wp:cNvGraphicFramePr>
-              <a:graphicFrameLocks noChangeAspect="1"/>
-            </wp:cNvGraphicFramePr>
-            <a:graphic>
-              <a:graphicData uri="http://schemas.openxmlformats.org/drawingml/2006/picture">
-                <pic:pic>
-                  <pic:nvPicPr>
-                    <pic:cNvPr id="0" name="screen_3_annotated.png"/>
-                    <pic:cNvPicPr/>
-                  </pic:nvPicPr>
-                  <pic:blipFill>
-                    <a:blip r:embed="rId11"/>
-                    <a:stretch>
-                      <a:fillRect/>
-                    </a:stretch>
-                  </pic:blipFill>
-                  <pic:spPr>
-                    <a:xfrm>
-                      <a:off x="0" y="0"/>
-                      <a:ext cx="5486400" cy="2744640"/>
-                    </a:xfrm>
-                    <a:prstGeom prst="rect"/>
-                  </pic:spPr>
-                </pic:pic>
-              </a:graphicData>
-            </a:graphic>
-          </wp:inline>
-        </w:drawing>
-      </w:r>
-    </w:p>
-    <w:p>
-      <w:pPr>
-        <w:pStyle w:val="Caption"/>
-        <w:jc w:val="center"/>
-      </w:pPr>
-      <w:r>
-        <w:t>Figure 3: Screen 3 View</w:t>
-      </w:r>
-    </w:p>
-    <w:p>
-      <w:pPr>
-        <w:pStyle w:val="Heading2"/>
-      </w:pPr>
-      <w:r>
-        <w:t>Procedure Steps</w:t>
-      </w:r>
-    </w:p>
-    <w:p>
-      <w:r>
-        <w:t xml:space="preserve">1. Click the **Back to Products** button to navigate from the current screen to the product listing page, allowing the user to select additional items.  </w:t>
-        <w:br/>
-        <w:t xml:space="preserve">2. Click the **Remove** button to delete the selected product from the shopping cart; a confirmation message “Item removed from cart” is displayed on success, while an error message “Unable to remove item” appears if the removal fails.  </w:t>
-        <w:br/>
-        <w:t>3. Review the data in the **Add to Cart** section to confirm that the removed product no longer appears, ensuring the cart contents are accurate; no validation or error messages are shown during this review.</w:t>
-      </w:r>
-    </w:p>
-    <w:p>
-      <w:r>
-        <w:br w:type="page"/>
-      </w:r>
-    </w:p>
-    <w:p>
-      <w:pPr>
-        <w:pStyle w:val="Heading1"/>
-      </w:pPr>
-      <w:r>
-        <w:t>4. Screen 4 Interface</w:t>
-      </w:r>
-    </w:p>
-    <w:p>
-      <w:r>
-        <w:drawing>
-          <wp:inline xmlns:a="http://schemas.openxmlformats.org/drawingml/2006/main" xmlns:pic="http://schemas.openxmlformats.org/drawingml/2006/picture">
-            <wp:extent cx="5486400" cy="2700338"/>
-            <wp:docPr id="4" name="Picture 4"/>
             <wp:cNvGraphicFramePr>
               <a:graphicFrameLocks noChangeAspect="1"/>
             </wp:cNvGraphicFramePr>
@@ -588,7 +543,7 @@
                   <pic:spPr>
                     <a:xfrm>
                       <a:off x="0" y="0"/>
-                      <a:ext cx="5486400" cy="2700338"/>
+                      <a:ext cx="5303520" cy="2610326"/>
                     </a:xfrm>
                     <a:prstGeom prst="rect"/>
                   </pic:spPr>
@@ -602,10 +557,11 @@
     <w:p>
       <w:pPr>
         <w:pStyle w:val="Caption"/>
+        <w:spacing w:after="240"/>
         <w:jc w:val="center"/>
       </w:pPr>
       <w:r>
-        <w:t>Figure 4: Screen 4 View</w:t>
+        <w:t>Figure 1: User Interface Screen Layout</w:t>
       </w:r>
     </w:p>
     <w:p>
@@ -613,54 +569,122 @@
         <w:pStyle w:val="Heading2"/>
       </w:pPr>
       <w:r>
-        <w:t>Procedure Steps</w:t>
-      </w:r>
-    </w:p>
-    <w:p>
-      <w:r>
-        <w:t xml:space="preserve">1. Click the **User Name** field and type the user’s login identifier to identify the account (the system shows “User Name is required” if the field is left blank).  </w:t>
-        <w:br/>
-        <w:t xml:space="preserve">2. Click the **Redacted Filter** field and enter the required secret value to provide the primary credential for verification (an invalid entry triggers the error message “Invalid Redacted Filter”).  </w:t>
-        <w:br/>
-        <w:t>3. Click the **Login Filter** field and supply the secondary verification data (such as a captcha or OTP) to complete multi‑factor authentication (incorrect input results in the warning “Login Filter is incorrect”).</w:t>
+        <w:rPr>
+          <w:rFonts w:ascii="Arial" w:hAnsi="Arial"/>
+          <w:color w:val="D97706"/>
+        </w:rPr>
+        <w:t>Step-by-Step Instructions</w:t>
       </w:r>
     </w:p>
     <w:p>
       <w:pPr>
-        <w:pStyle w:val="Heading2"/>
+        <w:spacing w:line="276" w:lineRule="auto" w:after="120"/>
       </w:pPr>
       <w:r>
-        <w:t>Field Details</w:t>
+        <w:rPr>
+          <w:rFonts w:ascii="Arial" w:hAnsi="Arial"/>
+        </w:rPr>
+        <w:t>1. Enter the user’s login name in the Username Filter Panel to identify the account for authentication; if the field is empty, the system shows the error message “Username is required.”</w:t>
+      </w:r>
+    </w:p>
+    <w:p>
+      <w:pPr>
+        <w:spacing w:line="276" w:lineRule="auto" w:after="120"/>
+      </w:pPr>
+      <w:r>
+        <w:rPr>
+          <w:rFonts w:ascii="Arial" w:hAnsi="Arial"/>
+        </w:rPr>
+        <w:t>2. Populate the required fields in the Advanced Filter Panel (e.g., domain, department) to refine the login context; missing entries trigger the message “Please complete all advanced filter fields.”</w:t>
+      </w:r>
+    </w:p>
+    <w:p>
+      <w:pPr>
+        <w:spacing w:line="276" w:lineRule="auto" w:after="120"/>
+      </w:pPr>
+      <w:r>
+        <w:rPr>
+          <w:rFonts w:ascii="Arial" w:hAnsi="Arial"/>
+        </w:rPr>
+        <w:t>3. Click the Login button to submit the credentials and initiate the authentication process; if the credentials are incorrect, the system displays “Invalid username or password.”</w:t>
+      </w:r>
+    </w:p>
+    <w:p/>
+    <w:p>
+      <w:pPr>
+        <w:pStyle w:val="Heading2"/>
+        <w:spacing w:after="160"/>
+      </w:pPr>
+      <w:r>
+        <w:rPr>
+          <w:rFonts w:ascii="Arial" w:hAnsi="Arial"/>
+          <w:color w:val="D97706"/>
+        </w:rPr>
+        <w:t>Interface Element Dictionary</w:t>
       </w:r>
     </w:p>
     <w:tbl>
       <w:tblPr>
-        <w:tblStyle w:val="TableGrid"/>
         <w:tblW w:type="auto" w:w="0"/>
+        <w:tblLayout w:type="fixed"/>
         <w:tblLook w:firstColumn="1" w:firstRow="1" w:lastColumn="0" w:lastRow="0" w:noHBand="0" w:noVBand="1" w:val="04A0"/>
+        <w:tblBorders>
+          <w:top w:val="single" w:sz="4" w:space="0" w:color="E2E8F0"/>
+          <w:left w:val="single" w:sz="4" w:space="0" w:color="E2E8F0"/>
+          <w:bottom w:val="single" w:sz="4" w:space="0" w:color="E2E8F0"/>
+          <w:right w:val="single" w:sz="4" w:space="0" w:color="E2E8F0"/>
+          <w:insideH w:val="single" w:sz="4" w:space="0" w:color="E2E8F0"/>
+          <w:insideV w:val="single" w:sz="4" w:space="0" w:color="E2E8F0"/>
+        </w:tblBorders>
       </w:tblPr>
       <w:tblGrid>
-        <w:gridCol w:w="4320"/>
-        <w:gridCol w:w="4320"/>
+        <w:gridCol w:w="3168"/>
+        <w:gridCol w:w="6192"/>
       </w:tblGrid>
       <w:tr>
         <w:tc>
           <w:tcPr>
-            <w:tcW w:type="dxa" w:w="4320"/>
+            <w:tcW w:type="dxa" w:w="4680"/>
+            <w:shd w:fill="1B365D"/>
+            <w:tcMar>
+              <w:top w:w="120" w:type="dxa"/>
+              <w:bottom w:w="120" w:type="dxa"/>
+              <w:left w:w="150" w:type="dxa"/>
+              <w:right w:w="150" w:type="dxa"/>
+            </w:tcMar>
           </w:tcPr>
           <w:p>
             <w:r>
-              <w:t>Field Name</w:t>
+              <w:rPr>
+                <w:rFonts w:ascii="Arial" w:hAnsi="Arial"/>
+                <w:b/>
+                <w:color w:val="FFFFFF"/>
+                <w:sz w:val="19"/>
+              </w:rPr>
+              <w:t>User Interface Element</w:t>
             </w:r>
           </w:p>
         </w:tc>
         <w:tc>
           <w:tcPr>
-            <w:tcW w:type="dxa" w:w="4320"/>
+            <w:tcW w:type="dxa" w:w="4680"/>
+            <w:shd w:fill="1B365D"/>
+            <w:tcMar>
+              <w:top w:w="120" w:type="dxa"/>
+              <w:bottom w:w="120" w:type="dxa"/>
+              <w:left w:w="150" w:type="dxa"/>
+              <w:right w:w="150" w:type="dxa"/>
+            </w:tcMar>
           </w:tcPr>
           <w:p>
             <w:r>
-              <w:t>Description</w:t>
+              <w:rPr>
+                <w:rFonts w:ascii="Arial" w:hAnsi="Arial"/>
+                <w:b/>
+                <w:color w:val="FFFFFF"/>
+                <w:sz w:val="19"/>
+              </w:rPr>
+              <w:t>Purpose &amp; Functional Action</w:t>
             </w:r>
           </w:p>
         </w:tc>
@@ -668,21 +692,45 @@
       <w:tr>
         <w:tc>
           <w:tcPr>
-            <w:tcW w:type="dxa" w:w="4320"/>
+            <w:tcW w:type="dxa" w:w="3168"/>
+            <w:shd w:fill="FFFFFF"/>
+            <w:tcMar>
+              <w:top w:w="100" w:type="dxa"/>
+              <w:bottom w:w="100" w:type="dxa"/>
+              <w:left w:w="150" w:type="dxa"/>
+              <w:right w:w="150" w:type="dxa"/>
+            </w:tcMar>
           </w:tcPr>
           <w:p>
             <w:r>
-              <w:t>User Name -&gt; user-name</w:t>
+              <w:rPr>
+                <w:rFonts w:ascii="Arial" w:hAnsi="Arial"/>
+                <w:color w:val="333333"/>
+                <w:sz w:val="18"/>
+              </w:rPr>
+              <w:t>Username Filter Panel -&gt; username</w:t>
             </w:r>
           </w:p>
         </w:tc>
         <w:tc>
           <w:tcPr>
-            <w:tcW w:type="dxa" w:w="4320"/>
+            <w:tcW w:type="dxa" w:w="6192"/>
+            <w:shd w:fill="FFFFFF"/>
+            <w:tcMar>
+              <w:top w:w="100" w:type="dxa"/>
+              <w:bottom w:w="100" w:type="dxa"/>
+              <w:left w:w="150" w:type="dxa"/>
+              <w:right w:w="150" w:type="dxa"/>
+            </w:tcMar>
           </w:tcPr>
           <w:p>
             <w:r>
-              <w:t>Enter your username (optional). No specific length or format restrictions.</w:t>
+              <w:rPr>
+                <w:rFonts w:ascii="Arial" w:hAnsi="Arial"/>
+                <w:color w:val="333333"/>
+                <w:sz w:val="18"/>
+              </w:rPr>
+              <w:t>Enter the username to filter the list (optional). Up to 50 characters.</w:t>
             </w:r>
           </w:p>
         </w:tc>
@@ -690,191 +738,54 @@
       <w:tr>
         <w:tc>
           <w:tcPr>
-            <w:tcW w:type="dxa" w:w="4320"/>
+            <w:tcW w:type="dxa" w:w="3168"/>
+            <w:shd w:fill="F8FAFC"/>
+            <w:tcMar>
+              <w:top w:w="100" w:type="dxa"/>
+              <w:bottom w:w="100" w:type="dxa"/>
+              <w:left w:w="150" w:type="dxa"/>
+              <w:right w:w="150" w:type="dxa"/>
+            </w:tcMar>
           </w:tcPr>
           <w:p>
             <w:r>
-              <w:t>Redacted Filter -&gt; [REDACTED]</w:t>
+              <w:rPr>
+                <w:rFonts w:ascii="Arial" w:hAnsi="Arial"/>
+                <w:color w:val="333333"/>
+                <w:sz w:val="18"/>
+              </w:rPr>
+              <w:t>Advanced Filter Panel -&gt; [REDACTED]</w:t>
             </w:r>
           </w:p>
         </w:tc>
         <w:tc>
           <w:tcPr>
-            <w:tcW w:type="dxa" w:w="4320"/>
+            <w:tcW w:type="dxa" w:w="6192"/>
+            <w:shd w:fill="F8FAFC"/>
+            <w:tcMar>
+              <w:top w:w="100" w:type="dxa"/>
+              <w:bottom w:w="100" w:type="dxa"/>
+              <w:left w:w="150" w:type="dxa"/>
+              <w:right w:w="150" w:type="dxa"/>
+            </w:tcMar>
           </w:tcPr>
           <w:p>
             <w:r>
-              <w:t>Enter your password (optional); the field masks characters for security.</w:t>
-            </w:r>
-          </w:p>
-        </w:tc>
-      </w:tr>
-      <w:tr>
-        <w:tc>
-          <w:tcPr>
-            <w:tcW w:type="dxa" w:w="4320"/>
-          </w:tcPr>
-          <w:p>
-            <w:r>
-              <w:t>Login Filter -&gt; Login</w:t>
-            </w:r>
-          </w:p>
-        </w:tc>
-        <w:tc>
-          <w:tcPr>
-            <w:tcW w:type="dxa" w:w="4320"/>
-          </w:tcPr>
-          <w:p>
-            <w:r>
-              <w:t>Tap the Login button to submit the entered credentials and sign in.</w:t>
+              <w:rPr>
+                <w:rFonts w:ascii="Arial" w:hAnsi="Arial"/>
+                <w:color w:val="333333"/>
+                <w:sz w:val="18"/>
+              </w:rPr>
+              <w:t>Enter the password for advanced filtering (optional). Minimum 8 characters.</w:t>
             </w:r>
           </w:p>
         </w:tc>
       </w:tr>
     </w:tbl>
     <w:p>
-      <w:r>
-        <w:br w:type="page"/>
-      </w:r>
-    </w:p>
-    <w:p>
       <w:pPr>
-        <w:pStyle w:val="Heading1"/>
+        <w:spacing w:before="160"/>
       </w:pPr>
-      <w:r>
-        <w:t>5. Screen 5 Interface</w:t>
-      </w:r>
-    </w:p>
-    <w:p>
-      <w:r>
-        <w:drawing>
-          <wp:inline xmlns:a="http://schemas.openxmlformats.org/drawingml/2006/main" xmlns:pic="http://schemas.openxmlformats.org/drawingml/2006/picture">
-            <wp:extent cx="5486400" cy="3196800"/>
-            <wp:docPr id="5" name="Picture 5"/>
-            <wp:cNvGraphicFramePr>
-              <a:graphicFrameLocks noChangeAspect="1"/>
-            </wp:cNvGraphicFramePr>
-            <a:graphic>
-              <a:graphicData uri="http://schemas.openxmlformats.org/drawingml/2006/picture">
-                <pic:pic>
-                  <pic:nvPicPr>
-                    <pic:cNvPr id="0" name="screen_2_annotated.png"/>
-                    <pic:cNvPicPr/>
-                  </pic:nvPicPr>
-                  <pic:blipFill>
-                    <a:blip r:embed="rId13"/>
-                    <a:stretch>
-                      <a:fillRect/>
-                    </a:stretch>
-                  </pic:blipFill>
-                  <pic:spPr>
-                    <a:xfrm>
-                      <a:off x="0" y="0"/>
-                      <a:ext cx="5486400" cy="3196800"/>
-                    </a:xfrm>
-                    <a:prstGeom prst="rect"/>
-                  </pic:spPr>
-                </pic:pic>
-              </a:graphicData>
-            </a:graphic>
-          </wp:inline>
-        </w:drawing>
-      </w:r>
-    </w:p>
-    <w:p>
-      <w:pPr>
-        <w:pStyle w:val="Caption"/>
-        <w:jc w:val="center"/>
-      </w:pPr>
-      <w:r>
-        <w:t>Figure 5: Screen 5 View</w:t>
-      </w:r>
-    </w:p>
-    <w:p>
-      <w:pPr>
-        <w:pStyle w:val="Heading2"/>
-      </w:pPr>
-      <w:r>
-        <w:t>Procedure Steps</w:t>
-      </w:r>
-    </w:p>
-    <w:p>
-      <w:r>
-        <w:t>--&gt; Paste Claude's Response directly here &lt;--</w:t>
-      </w:r>
-    </w:p>
-    <w:p>
-      <w:r>
-        <w:br w:type="page"/>
-      </w:r>
-    </w:p>
-    <w:p>
-      <w:pPr>
-        <w:pStyle w:val="Heading1"/>
-      </w:pPr>
-      <w:r>
-        <w:t>6. Screen 6 Interface</w:t>
-      </w:r>
-    </w:p>
-    <w:p>
-      <w:r>
-        <w:drawing>
-          <wp:inline xmlns:a="http://schemas.openxmlformats.org/drawingml/2006/main" xmlns:pic="http://schemas.openxmlformats.org/drawingml/2006/picture">
-            <wp:extent cx="5486400" cy="2744640"/>
-            <wp:docPr id="6" name="Picture 6"/>
-            <wp:cNvGraphicFramePr>
-              <a:graphicFrameLocks noChangeAspect="1"/>
-            </wp:cNvGraphicFramePr>
-            <a:graphic>
-              <a:graphicData uri="http://schemas.openxmlformats.org/drawingml/2006/picture">
-                <pic:pic>
-                  <pic:nvPicPr>
-                    <pic:cNvPr id="0" name="screen_3_annotated.png"/>
-                    <pic:cNvPicPr/>
-                  </pic:nvPicPr>
-                  <pic:blipFill>
-                    <a:blip r:embed="rId14"/>
-                    <a:stretch>
-                      <a:fillRect/>
-                    </a:stretch>
-                  </pic:blipFill>
-                  <pic:spPr>
-                    <a:xfrm>
-                      <a:off x="0" y="0"/>
-                      <a:ext cx="5486400" cy="2744640"/>
-                    </a:xfrm>
-                    <a:prstGeom prst="rect"/>
-                  </pic:spPr>
-                </pic:pic>
-              </a:graphicData>
-            </a:graphic>
-          </wp:inline>
-        </w:drawing>
-      </w:r>
-    </w:p>
-    <w:p>
-      <w:pPr>
-        <w:pStyle w:val="Caption"/>
-        <w:jc w:val="center"/>
-      </w:pPr>
-      <w:r>
-        <w:t>Figure 6: Screen 6 View</w:t>
-      </w:r>
-    </w:p>
-    <w:p>
-      <w:pPr>
-        <w:pStyle w:val="Heading2"/>
-      </w:pPr>
-      <w:r>
-        <w:t>Procedure Steps</w:t>
-      </w:r>
-    </w:p>
-    <w:p>
-      <w:r>
-        <w:t xml:space="preserve">1. Click the Back to Product button to return to the product catalogue, allowing the user to select a different item if desired.  </w:t>
-        <w:br/>
-        <w:t>2. Click the Add to Cart button to place the currently displayed product into the shopping cart; if the product is out of stock, the system will display the error message “Unable to add to cart – item is out of stock.”</w:t>
-      </w:r>
     </w:p>
     <w:p>
       <w:r>
@@ -882,13 +793,146 @@
       </w:r>
     </w:p>
     <w:sectPr>
+      <w:headerReference w:type="default" r:id="rId10"/>
+      <w:footerReference w:type="default" r:id="rId11"/>
       <w:pgSz w:w="12240" w:h="15840"/>
-      <w:pgMar w:top="1440" w:right="1800" w:bottom="1440" w:left="1800" w:header="720" w:footer="720" w:gutter="0"/>
+      <w:pgMar w:top="1440" w:right="1440" w:bottom="1440" w:left="1440" w:header="720" w:footer="720" w:gutter="0"/>
       <w:cols w:space="720"/>
+      <w:titlePg/>
       <w:docGrid w:linePitch="360"/>
     </w:sectPr>
   </w:body>
 </w:document>
+</file>
+
+<file path=word/footer1.xml><?xml version="1.0" encoding="utf-8"?>
+<w:ftr xmlns:m="http://schemas.openxmlformats.org/officeDocument/2006/math" xmlns:mc="http://schemas.openxmlformats.org/markup-compatibility/2006" xmlns:mo="http://schemas.microsoft.com/office/mac/office/2008/main" xmlns:mv="urn:schemas-microsoft-com:mac:vml" xmlns:o="urn:schemas-microsoft-com:office:office" xmlns:r="http://schemas.openxmlformats.org/officeDocument/2006/relationships" xmlns:v="urn:schemas-microsoft-com:vml" xmlns:w10="urn:schemas-microsoft-com:office:word" xmlns:w14="http://schemas.microsoft.com/office/word/2010/wordml" xmlns:w="http://schemas.openxmlformats.org/wordprocessingml/2006/main" xmlns:wne="http://schemas.microsoft.com/office/word/2006/wordml" xmlns:wp14="http://schemas.microsoft.com/office/word/2010/wordprocessingDrawing" xmlns:wp="http://schemas.openxmlformats.org/drawingml/2006/wordprocessingDrawing" xmlns:wpc="http://schemas.microsoft.com/office/word/2010/wordprocessingCanvas" xmlns:wpg="http://schemas.microsoft.com/office/word/2010/wordprocessingGroup" xmlns:wpi="http://schemas.microsoft.com/office/word/2010/wordprocessingInk" xmlns:wps="http://schemas.microsoft.com/office/word/2010/wordprocessingShape" mc:Ignorable="w14 wp14">
+  <w:p>
+    <w:pPr>
+      <w:pStyle w:val="Footer"/>
+      <w:jc w:val="right"/>
+    </w:pPr>
+    <w:r/>
+    <w:r>
+      <w:rPr>
+        <w:rFonts w:ascii="Arial" w:hAnsi="Arial"/>
+        <w:sz w:val="17"/>
+      </w:rPr>
+      <w:t xml:space="preserve">Page </w:t>
+    </w:r>
+    <w:r>
+      <w:fldChar w:fldCharType="begin"/>
+      <w:instrText xml:space="preserve">PAGE</w:instrText>
+      <w:fldChar w:fldCharType="separate"/>
+      <w:fldChar w:fldCharType="end"/>
+    </w:r>
+    <w:r>
+      <w:rPr>
+        <w:rFonts w:ascii="Arial" w:hAnsi="Arial"/>
+        <w:sz w:val="17"/>
+      </w:rPr>
+      <w:t xml:space="preserve"> of </w:t>
+    </w:r>
+    <w:r>
+      <w:fldChar w:fldCharType="begin"/>
+      <w:instrText xml:space="preserve">NUMPAGES</w:instrText>
+      <w:fldChar w:fldCharType="separate"/>
+      <w:fldChar w:fldCharType="end"/>
+    </w:r>
+  </w:p>
+</w:ftr>
+</file>
+
+<file path=word/header1.xml><?xml version="1.0" encoding="utf-8"?>
+<w:hdr xmlns:m="http://schemas.openxmlformats.org/officeDocument/2006/math" xmlns:mc="http://schemas.openxmlformats.org/markup-compatibility/2006" xmlns:mo="http://schemas.microsoft.com/office/mac/office/2008/main" xmlns:mv="urn:schemas-microsoft-com:mac:vml" xmlns:o="urn:schemas-microsoft-com:office:office" xmlns:r="http://schemas.openxmlformats.org/officeDocument/2006/relationships" xmlns:v="urn:schemas-microsoft-com:vml" xmlns:w10="urn:schemas-microsoft-com:office:word" xmlns:w14="http://schemas.microsoft.com/office/word/2010/wordml" xmlns:w="http://schemas.openxmlformats.org/wordprocessingml/2006/main" xmlns:wne="http://schemas.microsoft.com/office/word/2006/wordml" xmlns:wp14="http://schemas.microsoft.com/office/word/2010/wordprocessingDrawing" xmlns:wp="http://schemas.openxmlformats.org/drawingml/2006/wordprocessingDrawing" xmlns:wpc="http://schemas.microsoft.com/office/word/2010/wordprocessingCanvas" xmlns:wpg="http://schemas.microsoft.com/office/word/2010/wordprocessingGroup" xmlns:wpi="http://schemas.microsoft.com/office/word/2010/wordprocessingInk" xmlns:wps="http://schemas.microsoft.com/office/word/2010/wordprocessingShape" mc:Ignorable="w14 wp14">
+  <w:p>
+    <w:pPr>
+      <w:pStyle w:val="Header"/>
+    </w:pPr>
+    <w:r/>
+  </w:p>
+  <w:tbl>
+    <w:tblPr>
+      <w:tblW w:type="auto" w:w="0"/>
+      <w:tblLayout w:type="fixed"/>
+      <w:tblLook w:firstColumn="1" w:firstRow="1" w:lastColumn="0" w:lastRow="0" w:noHBand="0" w:noVBand="1" w:val="04A0"/>
+      <w:tblBorders>
+        <w:top w:val="none"/>
+        <w:left w:val="none"/>
+        <w:bottom w:val="none"/>
+        <w:right w:val="none"/>
+        <w:insideH w:val="none"/>
+        <w:insideV w:val="none"/>
+      </w:tblBorders>
+    </w:tblPr>
+    <w:tblGrid>
+      <w:gridCol w:w="4680"/>
+      <w:gridCol w:w="4680"/>
+    </w:tblGrid>
+    <w:tr>
+      <w:tc>
+        <w:tcPr>
+          <w:tcW w:type="dxa" w:w="4680"/>
+        </w:tcPr>
+        <w:p>
+          <w:r>
+            <w:drawing>
+              <wp:inline xmlns:a="http://schemas.openxmlformats.org/drawingml/2006/main" xmlns:pic="http://schemas.openxmlformats.org/drawingml/2006/picture">
+                <wp:extent cx="696686" cy="365760"/>
+                <wp:docPr id="1" name="Picture 1"/>
+                <wp:cNvGraphicFramePr>
+                  <a:graphicFrameLocks noChangeAspect="1"/>
+                </wp:cNvGraphicFramePr>
+                <a:graphic>
+                  <a:graphicData uri="http://schemas.openxmlformats.org/drawingml/2006/picture">
+                    <pic:pic>
+                      <pic:nvPicPr>
+                        <pic:cNvPr id="0" name="National-Emblem-of-India.jpg"/>
+                        <pic:cNvPicPr/>
+                      </pic:nvPicPr>
+                      <pic:blipFill>
+                        <a:blip r:embed="rId1"/>
+                        <a:stretch>
+                          <a:fillRect/>
+                        </a:stretch>
+                      </pic:blipFill>
+                      <pic:spPr>
+                        <a:xfrm>
+                          <a:off x="0" y="0"/>
+                          <a:ext cx="696686" cy="365760"/>
+                        </a:xfrm>
+                        <a:prstGeom prst="rect"/>
+                      </pic:spPr>
+                    </pic:pic>
+                  </a:graphicData>
+                </a:graphic>
+              </wp:inline>
+            </w:drawing>
+          </w:r>
+        </w:p>
+      </w:tc>
+      <w:tc>
+        <w:tcPr>
+          <w:tcW w:type="dxa" w:w="4680"/>
+        </w:tcPr>
+        <w:p>
+          <w:pPr>
+            <w:jc w:val="right"/>
+          </w:pPr>
+          <w:r>
+            <w:rPr>
+              <w:rFonts w:ascii="Arial" w:hAnsi="Arial"/>
+              <w:i/>
+              <w:color w:val="646464"/>
+              <w:sz w:val="17"/>
+            </w:rPr>
+            <w:t>OrangeHrms Manual</w:t>
+          </w:r>
+        </w:p>
+      </w:tc>
+    </w:tr>
+  </w:tbl>
+</w:hdr>
 </file>
 
 <file path=word/numbering.xml><?xml version="1.0" encoding="utf-8"?>
@@ -1256,7 +1300,8 @@
     <w:rsid w:val="00FC693F"/>
     <w:rPr>
       <w:rFonts w:ascii="Arial" w:hAnsi="Arial"/>
-      <w:sz w:val="22"/>
+      <w:color w:val="333333"/>
+      <w:sz w:val="21"/>
     </w:rPr>
   </w:style>
   <w:style w:type="paragraph" w:styleId="Header">
@@ -1318,10 +1363,10 @@
       <w:outlineLvl w:val="0"/>
     </w:pPr>
     <w:rPr>
-      <w:rFonts w:asciiTheme="majorHAnsi" w:eastAsiaTheme="majorEastAsia" w:hAnsiTheme="majorHAnsi" w:cstheme="majorBidi"/>
+      <w:rFonts w:asciiTheme="majorHAnsi" w:eastAsiaTheme="majorEastAsia" w:hAnsiTheme="majorHAnsi" w:cstheme="majorBidi" w:ascii="Arial" w:hAnsi="Arial"/>
       <w:b/>
       <w:bCs/>
-      <w:color w:val="365F91" w:themeColor="accent1" w:themeShade="BF"/>
+      <w:color w:val="1B365D"/>
       <w:sz w:val="28"/>
       <w:szCs w:val="28"/>
     </w:rPr>
@@ -1342,10 +1387,10 @@
       <w:outlineLvl w:val="1"/>
     </w:pPr>
     <w:rPr>
-      <w:rFonts w:asciiTheme="majorHAnsi" w:eastAsiaTheme="majorEastAsia" w:hAnsiTheme="majorHAnsi" w:cstheme="majorBidi"/>
+      <w:rFonts w:asciiTheme="majorHAnsi" w:eastAsiaTheme="majorEastAsia" w:hAnsiTheme="majorHAnsi" w:cstheme="majorBidi" w:ascii="Arial" w:hAnsi="Arial"/>
       <w:b/>
       <w:bCs/>
-      <w:color w:val="4F81BD" w:themeColor="accent1"/>
+      <w:color w:val="1B365D"/>
       <w:sz w:val="26"/>
       <w:szCs w:val="26"/>
     </w:rPr>
@@ -1366,10 +1411,10 @@
       <w:outlineLvl w:val="2"/>
     </w:pPr>
     <w:rPr>
-      <w:rFonts w:asciiTheme="majorHAnsi" w:eastAsiaTheme="majorEastAsia" w:hAnsiTheme="majorHAnsi" w:cstheme="majorBidi"/>
+      <w:rFonts w:asciiTheme="majorHAnsi" w:eastAsiaTheme="majorEastAsia" w:hAnsiTheme="majorHAnsi" w:cstheme="majorBidi" w:ascii="Arial" w:hAnsi="Arial"/>
       <w:b/>
       <w:bCs/>
-      <w:color w:val="4F81BD" w:themeColor="accent1"/>
+      <w:color w:val="1B365D"/>
     </w:rPr>
   </w:style>
   <w:style w:type="paragraph" w:styleId="Heading4">

</xml_diff>